<commit_message>
Docket: Vesta v2 payment terms per Kev (pay within 5 business days of receipt, no holdback)
Co-Authored-By: Claude Opus 5.5 <noreply@anthropic.com>
Claude-Session: https://claude.ai/code/session_01LKexcLmbP1uHLF2QuAEEJK
</commit_message>
<xml_diff>
--- a/projects/legal/vesta-search/01-EPG-Vesta-Split-Partner-Agreement-v2.docx
+++ b/projects/legal/vesta-search/01-EPG-Vesta-Split-Partner-Agreement-v2.docx
@@ -27,7 +27,7 @@
           <w:i/>
           <w:sz w:val="20"/>
         </w:rPr>
-        <w:t>Version 2 · 30 October 2026 · incorporates the Vesta Search redlines of 28 July 2026 and the payment terms agreed by email on 17 August 2026</w:t>
+        <w:t>Version 2 · 30 October 2026 · incorporates the Vesta Search redlines of 28 July 2026 and Eden's payment terms of 30 October 2026</w:t>
       </w:r>
     </w:p>
     <w:p>
@@ -131,38 +131,17 @@
     </w:p>
     <w:p>
       <w:r>
-        <w:t>4.1 The client-side recruiter will invoice the client within 5 business days after the candidate's start date and will send the candidate-side recruiter a copy of the invoice.</w:t>
+        <w:t>4.1 The client-side recruiter will invoice the client on the candidate's start date and will send the candidate-side recruiter a copy of the invoice.</w:t>
       </w:r>
     </w:p>
     <w:p>
       <w:r>
-        <w:t>4.2 The candidate-side recruiter's share is payable only from Fees the client-side recruiter actually collects. The client-side recruiter will use commercially reasonable efforts to collect, will report collection status within 3 business days of a request, and will not discount, settle or write off a Fee without first giving the other party written notice; any discount, settlement or write-off reduces both parties' shares in proportion.</w:t>
+        <w:t>4.2 The client-side recruiter will pay the candidate-side recruiter its full share within 5 business days after receiving payment of the Fee from the client. The share is payable only from Fees actually collected.</w:t>
       </w:r>
     </w:p>
     <w:p>
       <w:r>
-        <w:t>4.3 Guarantee holdback. If the client's fee agreement includes a guarantee period (a period after the start date during which the client is entitled to a replacement, refund or credit if the candidate leaves), the client-side recruiter will pay the candidate-side recruiter:</w:t>
-      </w:r>
-    </w:p>
-    <w:p>
-      <w:pPr>
-        <w:pStyle w:val="ListBullet"/>
-      </w:pPr>
-      <w:r>
-        <w:t>(a) 50% of its share within 5 business days after the client-side recruiter receives payment of the Fee; and</w:t>
-      </w:r>
-    </w:p>
-    <w:p>
-      <w:pPr>
-        <w:pStyle w:val="ListBullet"/>
-      </w:pPr>
-      <w:r>
-        <w:t>(b) the remaining 50% of its share within 5 business days after the later of (i) the end of the guarantee period and (ii) receipt of payment of the Fee.</w:t>
-      </w:r>
-    </w:p>
-    <w:p>
-      <w:r>
-        <w:t>If no guarantee period applies, the full share is paid under (a).</w:t>
+        <w:t>4.3 If a client is late in paying, the parties will work together in good faith to agree on the best course of action. Neither party will discount, settle or write off a Fee without the other party's agreement; any discount, settlement or write-off the parties agree reduces both shares in proportion.</w:t>
       </w:r>
     </w:p>
     <w:p>
@@ -188,7 +167,7 @@
     </w:p>
     <w:p>
       <w:r>
-        <w:t>5.2 If the client is instead entitled to a refund or credit (or no replacement is made within the time the client agreement allows, or within 90 days if it states none), the refund or credit is borne by the parties in proportion to their shares. The client-side recruiter first applies the unpaid holdback under section 4.3(b); the candidate-side recruiter repays any remaining part of its share within 30 days after written notice with a copy of the client's refund or credit.</w:t>
+        <w:t>5.2 If the client is instead entitled to a refund or credit (or no replacement is made within the time the client agreement allows, or within 90 days if it states none), the refund or credit is borne by the parties in proportion to their shares. If the candidate-side recruiter has already been paid, it repays its proportionate part within 30 days after written notice with a copy of the client's refund or credit.</w:t>
       </w:r>
     </w:p>
     <w:p>

</xml_diff>